<commit_message>
docs: record PRE.2 gate PASS + engine speedups (cache + n_jobs)
Update today's repo docs with the PRE.2 real-table result and the two engine
performance improvements landed while closing it:
* 20260709_performed_tasks.md: flip PRE.2 rows to PASS; new section 6.1
  (performance work: root causes, fixes, measured before/after, gate outcome).
* 20260709_proposed_development_architecture_steps.md: PRE.2 backlog/phase rows
  -> DONE/PASS; architecture diagram notes cube cache + n_jobs.
* AGENTS.md (root + docs): engine performance contract (per-SLR cache, n_jobs
  bit-identical parallel sequences); PRE.2 catalog entry updated.
* README.md: 120 -> 125 tests; note PRE.2 executed on the real table.
* .docx regenerated for the two 20260709 docs.

Co-authored-by: Copilot <223556219+Copilot@users.noreply.github.com>
</commit_message>
<xml_diff>
--- a/docs/20260709_performed_tasks.docx
+++ b/docs/20260709_performed_tasks.docx
@@ -1375,10 +1375,10 @@
               <w:rPr>
                 <w:b/>
               </w:rPr>
-              <w:t>RUNNING</w:t>
+              <w:t>PASS</w:t>
             </w:r>
             <w:r>
-              <w:t xml:space="preserve"> on the real 61,858 × 207 Charleston table (long-running, tracemalloc-profiled; report/metrics land in </w:t>
+              <w:t xml:space="preserve"> — executed on the real 61,858 × 207 Charleston table (57,976 residential agents). </w:t>
             </w:r>
             <w:r>
               <w:rPr>
@@ -1386,10 +1386,32 @@
                 <w:color w:val="A03030"/>
                 <w:sz w:val="18"/>
               </w:rPr>
-              <w:t>verification/real_table_gate/</w:t>
+              <w:t>gate_pass: True</w:t>
             </w:r>
             <w:r>
-              <w:t xml:space="preserve"> on completion — see §6)</w:t>
+              <w:t xml:space="preserve"> (phase-4b bit-parity + phase-4a subset parity both True). Run A </w:t>
+            </w:r>
+            <w:r>
+              <w:rPr>
+                <w:rFonts w:ascii="Consolas" w:hAnsi="Consolas"/>
+                <w:color w:val="A03030"/>
+                <w:sz w:val="18"/>
+              </w:rPr>
+              <w:t>engine.run</w:t>
+            </w:r>
+            <w:r>
+              <w:t xml:space="preserve"> (SEURule, parallel) 73.7 s / 3.3 GiB; run B </w:t>
+            </w:r>
+            <w:r>
+              <w:rPr>
+                <w:rFonts w:ascii="Consolas" w:hAnsi="Consolas"/>
+                <w:color w:val="A03030"/>
+                <w:sz w:val="18"/>
+              </w:rPr>
+              <w:t>run_mesa_native</w:t>
+            </w:r>
+            <w:r>
+              <w:t xml:space="preserve"> 119.4 s / 4.8 GiB; per-tick mean 2.62 s. See §6 + §6.1.</w:t>
             </w:r>
           </w:p>
         </w:tc>
@@ -1532,10 +1554,21 @@
         <w:rPr>
           <w:b/>
         </w:rPr>
-        <w:t>launched</w:t>
+        <w:t>DONE / PASS</w:t>
       </w:r>
       <w:r>
-        <w:t xml:space="preserve"> (long-running full-scale run; report/metrics land in </w:t>
+        <w:t xml:space="preserve"> (</w:t>
+      </w:r>
+      <w:r>
+        <w:rPr>
+          <w:rFonts w:ascii="Consolas" w:hAnsi="Consolas"/>
+          <w:color w:val="A03030"/>
+          <w:sz w:val="18"/>
+        </w:rPr>
+        <w:t>gate_pass: True</w:t>
+      </w:r>
+      <w:r>
+        <w:t xml:space="preserve"> on the real 61,858 × 207 table; report + metrics in </w:t>
       </w:r>
       <w:r>
         <w:rPr>
@@ -1546,7 +1579,7 @@
         <w:t>verification/real_table_gate/</w:t>
       </w:r>
       <w:r>
-        <w:t xml:space="preserve"> on completion).</w:t>
+        <w:t>; see §6.1). Required fixing a full-scale interpolation bottleneck first (see §6.1).</w:t>
       </w:r>
     </w:p>
     <w:p>
@@ -2138,10 +2171,10 @@
               <w:rPr>
                 <w:b/>
               </w:rPr>
-              <w:t>Launched</w:t>
+              <w:t>gate_pass: True</w:t>
             </w:r>
             <w:r>
-              <w:t xml:space="preserve"> on the real 61,858 × 207 table (full-scale, tracemalloc-profiled — long-running); report/metrics written to </w:t>
+              <w:t xml:space="preserve"> on the real 61,858 × 207 table (57,976 residential agents; 3 seq × 30 y). </w:t>
             </w:r>
             <w:r>
               <w:rPr>
@@ -2149,10 +2182,43 @@
                 <w:color w:val="A03030"/>
                 <w:sz w:val="18"/>
               </w:rPr>
-              <w:t>verification/real_table_gate/</w:t>
+              <w:t>phase4b_bit_parity_real_table: True</w:t>
             </w:r>
             <w:r>
-              <w:t xml:space="preserve"> on completion.</w:t>
+              <w:t xml:space="preserve">, </w:t>
+            </w:r>
+            <w:r>
+              <w:rPr>
+                <w:rFonts w:ascii="Consolas" w:hAnsi="Consolas"/>
+                <w:color w:val="A03030"/>
+                <w:sz w:val="18"/>
+              </w:rPr>
+              <w:t>phase4a_parity_real_table_subset: True</w:t>
+            </w:r>
+            <w:r>
+              <w:t xml:space="preserve">. Run A (parallel </w:t>
+            </w:r>
+            <w:r>
+              <w:rPr>
+                <w:rFonts w:ascii="Consolas" w:hAnsi="Consolas"/>
+                <w:color w:val="A03030"/>
+                <w:sz w:val="18"/>
+              </w:rPr>
+              <w:t>engine.run</w:t>
+            </w:r>
+            <w:r>
+              <w:t>) 73.7 s / 3.3 GiB; run B (</w:t>
+            </w:r>
+            <w:r>
+              <w:rPr>
+                <w:rFonts w:ascii="Consolas" w:hAnsi="Consolas"/>
+                <w:color w:val="A03030"/>
+                <w:sz w:val="18"/>
+              </w:rPr>
+              <w:t>run_mesa_native</w:t>
+            </w:r>
+            <w:r>
+              <w:t>) 119.4 s / 4.8 GiB; per-tick mean 2.62 s, max 8.96 s.</w:t>
             </w:r>
           </w:p>
         </w:tc>
@@ -2471,6 +2537,710 @@
     <w:p>
       <w:r>
         <w:t>— End of work log —</w:t>
+      </w:r>
+    </w:p>
+    <w:p>
+      <w:pPr>
+        <w:pStyle w:val="Heading2"/>
+      </w:pPr>
+      <w:r>
+        <w:t>6.1 Performance work (2026-07-09, follow-up)</w:t>
+      </w:r>
+    </w:p>
+    <w:p>
+      <w:r>
+        <w:t>Running PRE.2 at full scale surfaced a hot-path bottleneck that made the gate</w:t>
+      </w:r>
+    </w:p>
+    <w:p>
+      <w:r>
+        <w:t>impractically slow (&gt;11 min, previously mislabelled a "tracemalloc" stall). Two</w:t>
+      </w:r>
+    </w:p>
+    <w:p>
+      <w:r>
+        <w:t>independent causes were found and fixed; the fixes are committed engine</w:t>
+      </w:r>
+    </w:p>
+    <w:p>
+      <w:r>
+        <w:t>improvements (not just harness tweaks) and benefit the coming 4b-full runs.</w:t>
+      </w:r>
+    </w:p>
+    <w:p>
+      <w:r>
+        <w:rPr>
+          <w:b/>
+        </w:rPr>
+        <w:t>Root causes.</w:t>
+      </w:r>
+    </w:p>
+    <w:p>
+      <w:pPr>
+        <w:pStyle w:val="ListNumber"/>
+      </w:pPr>
+      <w:r>
+        <w:rPr>
+          <w:rFonts w:ascii="Consolas" w:hAnsi="Consolas"/>
+          <w:color w:val="A03030"/>
+          <w:sz w:val="18"/>
+        </w:rPr>
+        <w:t>DynamoDecisionBridge.prepare_damage_arrays()</w:t>
+      </w:r>
+      <w:r>
+        <w:t xml:space="preserve"> re-interpolated the entire</w:t>
+      </w:r>
+    </w:p>
+    <w:p>
+      <w:r>
+        <w:t xml:space="preserve">   61,858 × 207 damage catalogue on **every tick of every Monte-Carlo</w:t>
+      </w:r>
+    </w:p>
+    <w:p>
+      <w:r>
+        <w:t xml:space="preserve">   sequence**, even though the SLR trajectory is identical across sequences</w:t>
+      </w:r>
+    </w:p>
+    <w:p>
+      <w:r>
+        <w:t xml:space="preserve">   (</w:t>
+      </w:r>
+      <w:r>
+        <w:rPr>
+          <w:rFonts w:ascii="Consolas" w:hAnsi="Consolas"/>
+          <w:color w:val="A03030"/>
+          <w:sz w:val="18"/>
+        </w:rPr>
+        <w:t>no_seq×</w:t>
+      </w:r>
+      <w:r>
+        <w:t xml:space="preserve"> redundant work). ~5.5 s per call at scale.</w:t>
+      </w:r>
+    </w:p>
+    <w:p>
+      <w:pPr>
+        <w:pStyle w:val="ListNumber"/>
+      </w:pPr>
+      <w:r>
+        <w:t xml:space="preserve">Inside the kernel, the residential subset was taken with a **boolean </w:t>
+      </w:r>
+      <w:r>
+        <w:rPr>
+          <w:rFonts w:ascii="Consolas" w:hAnsi="Consolas"/>
+          <w:color w:val="A03030"/>
+          <w:sz w:val="18"/>
+        </w:rPr>
+        <w:t>isel</w:t>
+      </w:r>
+    </w:p>
+    <w:p>
+      <w:r>
+        <w:t xml:space="preserve">   on the lazily backed xarray cube** — pathologically slow at scale (~24 s for</w:t>
+      </w:r>
+    </w:p>
+    <w:p>
+      <w:r>
+        <w:t xml:space="preserve">   the first materialization).</w:t>
+      </w:r>
+    </w:p>
+    <w:p>
+      <w:r>
+        <w:rPr>
+          <w:b/>
+        </w:rPr>
+        <w:t>Fixes (commit `6f45d6f`).</w:t>
+      </w:r>
+    </w:p>
+    <w:p>
+      <w:pPr>
+        <w:pStyle w:val="ListBullet"/>
+      </w:pPr>
+      <w:r>
+        <w:rPr>
+          <w:rFonts w:ascii="Consolas" w:hAnsi="Consolas"/>
+          <w:color w:val="A03030"/>
+          <w:sz w:val="18"/>
+        </w:rPr>
+        <w:t>lookup_utils</w:t>
+      </w:r>
+      <w:r>
+        <w:t xml:space="preserve">: split </w:t>
+      </w:r>
+      <w:r>
+        <w:rPr>
+          <w:rFonts w:ascii="Consolas" w:hAnsi="Consolas"/>
+          <w:color w:val="A03030"/>
+          <w:sz w:val="18"/>
+        </w:rPr>
+        <w:t>materialize_strategy_cube()</w:t>
+      </w:r>
+      <w:r>
+        <w:t xml:space="preserve"> (materialize the full</w:t>
+      </w:r>
+    </w:p>
+    <w:p>
+      <w:r>
+        <w:t xml:space="preserve">  cube in NumPy, then mask in-memory) from </w:t>
+      </w:r>
+      <w:r>
+        <w:rPr>
+          <w:rFonts w:ascii="Consolas" w:hAnsi="Consolas"/>
+          <w:color w:val="A03030"/>
+          <w:sz w:val="18"/>
+        </w:rPr>
+        <w:t>interpolate_cube_at_slr()</w:t>
+      </w:r>
+    </w:p>
+    <w:p>
+      <w:r>
+        <w:t xml:space="preserve">  (unchanged </w:t>
+      </w:r>
+      <w:r>
+        <w:rPr>
+          <w:rFonts w:ascii="Consolas" w:hAnsi="Consolas"/>
+          <w:color w:val="A03030"/>
+          <w:sz w:val="18"/>
+        </w:rPr>
+        <w:t>interp1d</w:t>
+      </w:r>
+      <w:r>
+        <w:t xml:space="preserve"> math → bit-identical results).</w:t>
+      </w:r>
+    </w:p>
+    <w:p>
+      <w:pPr>
+        <w:pStyle w:val="ListBullet"/>
+      </w:pPr>
+      <w:r>
+        <w:t xml:space="preserve">Bridge: materialize each strategy cube </w:t>
+      </w:r>
+      <w:r>
+        <w:rPr>
+          <w:b/>
+        </w:rPr>
+        <w:t>once</w:t>
+      </w:r>
+      <w:r>
+        <w:t>, and memoise</w:t>
+      </w:r>
+    </w:p>
+    <w:p>
+      <w:r>
+        <w:t xml:space="preserve">  </w:t>
+      </w:r>
+      <w:r>
+        <w:rPr>
+          <w:rFonts w:ascii="Consolas" w:hAnsi="Consolas"/>
+          <w:color w:val="A03030"/>
+          <w:sz w:val="18"/>
+        </w:rPr>
+        <w:t>prepare_damage_arrays</w:t>
+      </w:r>
+      <w:r>
+        <w:t xml:space="preserve"> per </w:t>
+      </w:r>
+      <w:r>
+        <w:rPr>
+          <w:rFonts w:ascii="Consolas" w:hAnsi="Consolas"/>
+          <w:color w:val="A03030"/>
+          <w:sz w:val="18"/>
+        </w:rPr>
+        <w:t>(SLR, method)</w:t>
+      </w:r>
+      <w:r>
+        <w:t>; cached matrices are read-only.</w:t>
+      </w:r>
+    </w:p>
+    <w:p>
+      <w:pPr>
+        <w:pStyle w:val="ListBullet"/>
+      </w:pPr>
+      <w:r>
+        <w:rPr>
+          <w:rFonts w:ascii="Consolas" w:hAnsi="Consolas"/>
+          <w:color w:val="A03030"/>
+          <w:sz w:val="18"/>
+        </w:rPr>
+        <w:t>SimulationEngine.run(n_jobs=...)</w:t>
+      </w:r>
+      <w:r>
+        <w:t>: run the independent sequences across a</w:t>
+      </w:r>
+    </w:p>
+    <w:p>
+      <w:r>
+        <w:t xml:space="preserve">  thread pool of per-worker engine clones sharing a pre-warmed, read-only SLR</w:t>
+      </w:r>
+    </w:p>
+    <w:p>
+      <w:r>
+        <w:t xml:space="preserve">  cache. </w:t>
+      </w:r>
+      <w:r>
+        <w:rPr>
+          <w:rFonts w:ascii="Consolas" w:hAnsi="Consolas"/>
+          <w:color w:val="A03030"/>
+          <w:sz w:val="18"/>
+        </w:rPr>
+        <w:t>n_jobs=1</w:t>
+      </w:r>
+      <w:r>
+        <w:t xml:space="preserve"> (default) leaves the sequential path untouched; parallel</w:t>
+      </w:r>
+    </w:p>
+    <w:p>
+      <w:r>
+        <w:t xml:space="preserve">  output is </w:t>
+      </w:r>
+      <w:r>
+        <w:rPr>
+          <w:b/>
+        </w:rPr>
+        <w:t>bit-identical</w:t>
+      </w:r>
+      <w:r>
+        <w:t xml:space="preserve"> for deterministic rules.</w:t>
+      </w:r>
+    </w:p>
+    <w:p>
+      <w:pPr>
+        <w:pStyle w:val="ListBullet"/>
+      </w:pPr>
+      <w:r>
+        <w:rPr>
+          <w:rFonts w:ascii="Consolas" w:hAnsi="Consolas"/>
+          <w:color w:val="A03030"/>
+          <w:sz w:val="18"/>
+        </w:rPr>
+        <w:t>DecisionRule.clone()</w:t>
+      </w:r>
+      <w:r>
+        <w:t xml:space="preserve"> for isolated per-worker rule instances.</w:t>
+      </w:r>
+    </w:p>
+    <w:p>
+      <w:r>
+        <w:rPr>
+          <w:b/>
+        </w:rPr>
+        <w:t>Measured effect (real Charleston table).</w:t>
+      </w:r>
+    </w:p>
+    <w:tbl>
+      <w:tblPr>
+        <w:tblStyle w:val="LightGrid-Accent1"/>
+        <w:tblW w:type="auto" w:w="0"/>
+        <w:tblLook w:firstColumn="1" w:firstRow="1" w:lastColumn="0" w:lastRow="0" w:noHBand="0" w:noVBand="1" w:val="04A0"/>
+      </w:tblPr>
+      <w:tblGrid>
+        <w:gridCol w:w="2880"/>
+        <w:gridCol w:w="2880"/>
+        <w:gridCol w:w="2880"/>
+      </w:tblGrid>
+      <w:tr>
+        <w:tc>
+          <w:tcPr>
+            <w:tcW w:type="dxa" w:w="2880"/>
+          </w:tcPr>
+          <w:p>
+            <w:r>
+              <w:rPr>
+                <w:b/>
+              </w:rPr>
+              <w:t>Metric</w:t>
+            </w:r>
+          </w:p>
+        </w:tc>
+        <w:tc>
+          <w:tcPr>
+            <w:tcW w:type="dxa" w:w="2880"/>
+          </w:tcPr>
+          <w:p>
+            <w:r>
+              <w:rPr>
+                <w:b/>
+              </w:rPr>
+              <w:t>Before</w:t>
+            </w:r>
+          </w:p>
+        </w:tc>
+        <w:tc>
+          <w:tcPr>
+            <w:tcW w:type="dxa" w:w="2880"/>
+          </w:tcPr>
+          <w:p>
+            <w:r>
+              <w:rPr>
+                <w:b/>
+              </w:rPr>
+              <w:t>After</w:t>
+            </w:r>
+          </w:p>
+        </w:tc>
+      </w:tr>
+      <w:tr>
+        <w:tc>
+          <w:tcPr>
+            <w:tcW w:type="dxa" w:w="2880"/>
+          </w:tcPr>
+          <w:p>
+            <w:r>
+              <w:t>First cube materialization (masked)</w:t>
+            </w:r>
+          </w:p>
+        </w:tc>
+        <w:tc>
+          <w:tcPr>
+            <w:tcW w:type="dxa" w:w="2880"/>
+          </w:tcPr>
+          <w:p>
+            <w:r>
+              <w:t>~24 s</w:t>
+            </w:r>
+          </w:p>
+        </w:tc>
+        <w:tc>
+          <w:tcPr>
+            <w:tcW w:type="dxa" w:w="2880"/>
+          </w:tcPr>
+          <w:p>
+            <w:r>
+              <w:t>~3.6 s</w:t>
+            </w:r>
+          </w:p>
+        </w:tc>
+      </w:tr>
+      <w:tr>
+        <w:tc>
+          <w:tcPr>
+            <w:tcW w:type="dxa" w:w="2880"/>
+          </w:tcPr>
+          <w:p>
+            <w:r>
+              <w:t>Interpolation per distinct SLR</w:t>
+            </w:r>
+          </w:p>
+        </w:tc>
+        <w:tc>
+          <w:tcPr>
+            <w:tcW w:type="dxa" w:w="2880"/>
+          </w:tcPr>
+          <w:p>
+            <w:r>
+              <w:t>~5.5 s</w:t>
+            </w:r>
+          </w:p>
+        </w:tc>
+        <w:tc>
+          <w:tcPr>
+            <w:tcW w:type="dxa" w:w="2880"/>
+          </w:tcPr>
+          <w:p>
+            <w:r>
+              <w:t>~1.0 s</w:t>
+            </w:r>
+          </w:p>
+        </w:tc>
+      </w:tr>
+      <w:tr>
+        <w:tc>
+          <w:tcPr>
+            <w:tcW w:type="dxa" w:w="2880"/>
+          </w:tcPr>
+          <w:p>
+            <w:r>
+              <w:t>Interpolation on repeated SLR</w:t>
+            </w:r>
+          </w:p>
+        </w:tc>
+        <w:tc>
+          <w:tcPr>
+            <w:tcW w:type="dxa" w:w="2880"/>
+          </w:tcPr>
+          <w:p>
+            <w:r>
+              <w:t>~5.5 s</w:t>
+            </w:r>
+          </w:p>
+        </w:tc>
+        <w:tc>
+          <w:tcPr>
+            <w:tcW w:type="dxa" w:w="2880"/>
+          </w:tcPr>
+          <w:p>
+            <w:r>
+              <w:t>~0 s (cache hit)</w:t>
+            </w:r>
+          </w:p>
+        </w:tc>
+      </w:tr>
+      <w:tr>
+        <w:tc>
+          <w:tcPr>
+            <w:tcW w:type="dxa" w:w="2880"/>
+          </w:tcPr>
+          <w:p>
+            <w:r>
+              <w:rPr>
+                <w:rFonts w:ascii="Consolas" w:hAnsi="Consolas"/>
+                <w:color w:val="A03030"/>
+                <w:sz w:val="18"/>
+              </w:rPr>
+              <w:t>engine.run</w:t>
+            </w:r>
+            <w:r>
+              <w:t xml:space="preserve"> 4 seq × 30 y (sequential)</w:t>
+            </w:r>
+          </w:p>
+        </w:tc>
+        <w:tc>
+          <w:tcPr>
+            <w:tcW w:type="dxa" w:w="2880"/>
+          </w:tcPr>
+          <w:p>
+            <w:r>
+              <w:t>116.7 s</w:t>
+            </w:r>
+          </w:p>
+        </w:tc>
+        <w:tc>
+          <w:tcPr>
+            <w:tcW w:type="dxa" w:w="2880"/>
+          </w:tcPr>
+          <w:p>
+            <w:r>
+              <w:t>—</w:t>
+            </w:r>
+          </w:p>
+        </w:tc>
+      </w:tr>
+      <w:tr>
+        <w:tc>
+          <w:tcPr>
+            <w:tcW w:type="dxa" w:w="2880"/>
+          </w:tcPr>
+          <w:p>
+            <w:r>
+              <w:rPr>
+                <w:rFonts w:ascii="Consolas" w:hAnsi="Consolas"/>
+                <w:color w:val="A03030"/>
+                <w:sz w:val="18"/>
+              </w:rPr>
+              <w:t>engine.run</w:t>
+            </w:r>
+            <w:r>
+              <w:t xml:space="preserve"> 4 seq × 30 y (</w:t>
+            </w:r>
+            <w:r>
+              <w:rPr>
+                <w:rFonts w:ascii="Consolas" w:hAnsi="Consolas"/>
+                <w:color w:val="A03030"/>
+                <w:sz w:val="18"/>
+              </w:rPr>
+              <w:t>n_jobs=-1</w:t>
+            </w:r>
+            <w:r>
+              <w:t>)</w:t>
+            </w:r>
+          </w:p>
+        </w:tc>
+        <w:tc>
+          <w:tcPr>
+            <w:tcW w:type="dxa" w:w="2880"/>
+          </w:tcPr>
+          <w:p>
+            <w:r>
+              <w:t>—</w:t>
+            </w:r>
+          </w:p>
+        </w:tc>
+        <w:tc>
+          <w:tcPr>
+            <w:tcW w:type="dxa" w:w="2880"/>
+          </w:tcPr>
+          <w:p>
+            <w:r>
+              <w:t>83.3 s (×1.4, bit-identical)</w:t>
+            </w:r>
+          </w:p>
+        </w:tc>
+      </w:tr>
+    </w:tbl>
+    <w:p/>
+    <w:p>
+      <w:r>
+        <w:rPr>
+          <w:b/>
+        </w:rPr>
+        <w:t>Gate outcome.</w:t>
+      </w:r>
+      <w:r>
+        <w:t xml:space="preserve"> </w:t>
+      </w:r>
+      <w:r>
+        <w:rPr>
+          <w:rFonts w:ascii="Consolas" w:hAnsi="Consolas"/>
+          <w:color w:val="A03030"/>
+          <w:sz w:val="18"/>
+        </w:rPr>
+        <w:t>verification/real_table_gate/real_table_report.md</w:t>
+      </w:r>
+      <w:r>
+        <w:t>:</w:t>
+      </w:r>
+    </w:p>
+    <w:p>
+      <w:r>
+        <w:rPr>
+          <w:rFonts w:ascii="Consolas" w:hAnsi="Consolas"/>
+          <w:color w:val="A03030"/>
+          <w:sz w:val="18"/>
+        </w:rPr>
+        <w:t>Gate: PASS</w:t>
+      </w:r>
+      <w:r>
+        <w:t xml:space="preserve"> — </w:t>
+      </w:r>
+      <w:r>
+        <w:rPr>
+          <w:rFonts w:ascii="Consolas" w:hAnsi="Consolas"/>
+          <w:color w:val="A03030"/>
+          <w:sz w:val="18"/>
+        </w:rPr>
+        <w:t>phase4b_bit_parity_real_table: True</w:t>
+      </w:r>
+      <w:r>
+        <w:t>,</w:t>
+      </w:r>
+    </w:p>
+    <w:p>
+      <w:r>
+        <w:rPr>
+          <w:rFonts w:ascii="Consolas" w:hAnsi="Consolas"/>
+          <w:color w:val="A03030"/>
+          <w:sz w:val="18"/>
+        </w:rPr>
+        <w:t>phase4a_parity_real_table_subset: True</w:t>
+      </w:r>
+      <w:r>
+        <w:t>.</w:t>
+      </w:r>
+    </w:p>
+    <w:p>
+      <w:r>
+        <w:rPr>
+          <w:b/>
+        </w:rPr>
+        <w:t>Harness note (local-only).</w:t>
+      </w:r>
+      <w:r>
+        <w:t xml:space="preserve"> </w:t>
+      </w:r>
+      <w:r>
+        <w:rPr>
+          <w:rFonts w:ascii="Consolas" w:hAnsi="Consolas"/>
+          <w:color w:val="A03030"/>
+          <w:sz w:val="18"/>
+        </w:rPr>
+        <w:t>run_real_table_gate.py</w:t>
+      </w:r>
+      <w:r>
+        <w:t xml:space="preserve"> now makes tracemalloc</w:t>
+      </w:r>
+    </w:p>
+    <w:p>
+      <w:r>
+        <w:t>opt-in (</w:t>
+      </w:r>
+      <w:r>
+        <w:rPr>
+          <w:rFonts w:ascii="Consolas" w:hAnsi="Consolas"/>
+          <w:color w:val="A03030"/>
+          <w:sz w:val="18"/>
+        </w:rPr>
+        <w:t>FA_ABM_GATE_PROFILE_MEM=1</w:t>
+      </w:r>
+      <w:r>
+        <w:t xml:space="preserve">, default off; cheap </w:t>
+      </w:r>
+      <w:r>
+        <w:rPr>
+          <w:rFonts w:ascii="Consolas" w:hAnsi="Consolas"/>
+          <w:color w:val="A03030"/>
+          <w:sz w:val="18"/>
+        </w:rPr>
+        <w:t>psutil</w:t>
+      </w:r>
+      <w:r>
+        <w:t xml:space="preserve"> RSS peak</w:t>
+      </w:r>
+    </w:p>
+    <w:p>
+      <w:r>
+        <w:t xml:space="preserve">otherwise) and exposes </w:t>
+      </w:r>
+      <w:r>
+        <w:rPr>
+          <w:rFonts w:ascii="Consolas" w:hAnsi="Consolas"/>
+          <w:color w:val="A03030"/>
+          <w:sz w:val="18"/>
+        </w:rPr>
+        <w:t>FA_ABM_GATE_JOBS</w:t>
+      </w:r>
+      <w:r>
+        <w:t xml:space="preserve"> for run A. </w:t>
+      </w:r>
+      <w:r>
+        <w:rPr>
+          <w:rFonts w:ascii="Consolas" w:hAnsi="Consolas"/>
+          <w:color w:val="A03030"/>
+          <w:sz w:val="18"/>
+        </w:rPr>
+        <w:t>verification/</w:t>
+      </w:r>
+      <w:r>
+        <w:t xml:space="preserve"> remains</w:t>
+      </w:r>
+    </w:p>
+    <w:p>
+      <w:r>
+        <w:t>git-ignored, so these harness edits stay local.</w:t>
+      </w:r>
+    </w:p>
+    <w:p>
+      <w:r>
+        <w:rPr>
+          <w:b/>
+        </w:rPr>
+        <w:t>Tests.</w:t>
+      </w:r>
+      <w:r>
+        <w:t xml:space="preserve"> Added cache bit-parity, cache-reuse, and </w:t>
+      </w:r>
+      <w:r>
+        <w:rPr>
+          <w:rFonts w:ascii="Consolas" w:hAnsi="Consolas"/>
+          <w:color w:val="A03030"/>
+          <w:sz w:val="18"/>
+        </w:rPr>
+        <w:t>n_jobs</w:t>
+      </w:r>
+      <w:r>
+        <w:t xml:space="preserve"> bit-parity</w:t>
+      </w:r>
+    </w:p>
+    <w:p>
+      <w:r>
+        <w:t xml:space="preserve">(SEURule + ThresholdRule) tests; full suite now </w:t>
+      </w:r>
+      <w:r>
+        <w:rPr>
+          <w:b/>
+        </w:rPr>
+        <w:t>125 passed</w:t>
+      </w:r>
+      <w:r>
+        <w:t xml:space="preserve"> locally.</w:t>
       </w:r>
     </w:p>
     <w:sectPr>

</xml_diff>